<commit_message>
Set KESTREL in CW45, fix the summit name, add room readouts
The story, case files, kit data and film now start in calendar week 45,
the summit week, with every milestone shifted by the same seven weeks.
The film says 'PM Summit 2026' on screen and in the narration. New
room readouts (ws2/rooms.html and a PDF) give each room C1-C6 a
read-aloud opening, what the agent takes versus what the PM keeps,
tests and a time-returned metric; the Pilot Pack gains 'hours
returned' and 'where that time goes'.

Co-Authored-By: Claude Opus 5.5 <noreply@anthropic.com>
Claude-Session: https://claude.ai/code/session_01Q2YJhmzjoSxdfw8ZKRnAPH
</commit_message>
<xml_diff>
--- a/ws2/files/WS2_Challenge_Cards.docx
+++ b/ws2/files/WS2_Challenge_Cards.docx
@@ -111,7 +111,7 @@
     </w:p>
     <w:p>
       <w:r>
-        <w:t xml:space="preserve">All six data packs come from one invented project that brings a new sensor-hub chip and its evaluation kit to a lead customer, “Customer Alpha”. The current week in the story is calendar week 38. Every name, date, figure and company is invented. The packs contain deliberate gaps and contradictions, so your tests have something real to catch.</w:t>
+        <w:t xml:space="preserve">All six data packs come from one invented project that brings a new sensor-hub chip and its evaluation kit to a lead customer, “Customer Alpha”. The current week in the story is calendar week 45. Every name, date, figure and company is invented. The packs contain deliberate gaps and contradictions, so your tests have something real to catch.</w:t>
       </w:r>
     </w:p>
     <w:tbl>
@@ -331,7 +331,7 @@
                 <w:sz w:val="20"/>
                 <w:szCs w:val="20"/>
               </w:rPr>
-              <w:t xml:space="preserve">CW34</w:t>
+              <w:t xml:space="preserve">CW41</w:t>
             </w:r>
           </w:p>
         </w:tc>
@@ -361,7 +361,7 @@
                 <w:sz w:val="20"/>
                 <w:szCs w:val="20"/>
               </w:rPr>
-              <w:t xml:space="preserve">CW34 (done)</w:t>
+              <w:t xml:space="preserve">CW41 (done)</w:t>
             </w:r>
           </w:p>
         </w:tc>
@@ -457,7 +457,7 @@
                 <w:sz w:val="20"/>
                 <w:szCs w:val="20"/>
               </w:rPr>
-              <w:t xml:space="preserve">CW40</w:t>
+              <w:t xml:space="preserve">CW47</w:t>
             </w:r>
           </w:p>
         </w:tc>
@@ -487,7 +487,7 @@
                 <w:sz w:val="20"/>
                 <w:szCs w:val="20"/>
               </w:rPr>
-              <w:t xml:space="preserve">CW40</w:t>
+              <w:t xml:space="preserve">CW47</w:t>
             </w:r>
           </w:p>
         </w:tc>
@@ -583,7 +583,7 @@
                 <w:sz w:val="20"/>
                 <w:szCs w:val="20"/>
               </w:rPr>
-              <w:t xml:space="preserve">CW41</w:t>
+              <w:t xml:space="preserve">CW48</w:t>
             </w:r>
           </w:p>
         </w:tc>
@@ -613,7 +613,7 @@
                 <w:sz w:val="20"/>
                 <w:szCs w:val="20"/>
               </w:rPr>
-              <w:t xml:space="preserve">CW43</w:t>
+              <w:t xml:space="preserve">CW50</w:t>
             </w:r>
           </w:p>
         </w:tc>
@@ -709,7 +709,7 @@
                 <w:sz w:val="20"/>
                 <w:szCs w:val="20"/>
               </w:rPr>
-              <w:t xml:space="preserve">CW46</w:t>
+              <w:t xml:space="preserve">CW53</w:t>
             </w:r>
           </w:p>
         </w:tc>
@@ -739,7 +739,7 @@
                 <w:sz w:val="20"/>
                 <w:szCs w:val="20"/>
               </w:rPr>
-              <w:t xml:space="preserve">CW46</w:t>
+              <w:t xml:space="preserve">CW53</w:t>
             </w:r>
           </w:p>
         </w:tc>
@@ -835,7 +835,7 @@
                 <w:sz w:val="20"/>
                 <w:szCs w:val="20"/>
               </w:rPr>
-              <w:t xml:space="preserve">CW48</w:t>
+              <w:t xml:space="preserve">CW02</w:t>
             </w:r>
           </w:p>
         </w:tc>
@@ -865,7 +865,7 @@
                 <w:sz w:val="20"/>
                 <w:szCs w:val="20"/>
               </w:rPr>
-              <w:t xml:space="preserve">CW48</w:t>
+              <w:t xml:space="preserve">CW02</w:t>
             </w:r>
           </w:p>
         </w:tc>
@@ -961,7 +961,7 @@
                 <w:sz w:val="20"/>
                 <w:szCs w:val="20"/>
               </w:rPr>
-              <w:t xml:space="preserve">CW50</w:t>
+              <w:t xml:space="preserve">CW04</w:t>
             </w:r>
           </w:p>
         </w:tc>
@@ -991,7 +991,7 @@
                 <w:sz w:val="20"/>
                 <w:szCs w:val="20"/>
               </w:rPr>
-              <w:t xml:space="preserve">CW50</w:t>
+              <w:t xml:space="preserve">CW04</w:t>
             </w:r>
           </w:p>
         </w:tc>
@@ -2476,7 +2476,7 @@
           <w:sz w:val="20"/>
           <w:szCs w:val="20"/>
         </w:rPr>
-        <w:t xml:space="preserve">CONTEXT: Project KESTREL (fictional). A new sensor-hub chip and evaluation kit for lead customer "Customer Alpha". Current week: CW38.</w:t>
+        <w:t xml:space="preserve">CONTEXT: Project KESTREL (fictional). A new sensor-hub chip and evaluation kit for lead customer "Customer Alpha". Current week: CW45.</w:t>
       </w:r>
     </w:p>
     <w:p>
@@ -2492,7 +2492,7 @@
           <w:sz w:val="19"/>
           <w:szCs w:val="19"/>
         </w:rPr>
-        <w:t xml:space="preserve">WEEKLY INPUTS RECEIVED, CW38</w:t>
+        <w:t xml:space="preserve">WEEKLY INPUTS RECEIVED, CW45</w:t>
       </w:r>
     </w:p>
     <w:p>
@@ -2521,7 +2521,7 @@
           <w:sz w:val="20"/>
           <w:szCs w:val="20"/>
         </w:rPr>
-        <w:t xml:space="preserve">Hi, design status: timing closure on the PMU block still open, 3 paths failing, team working the weekend. Everything else frozen. Should be OK for tape-out CW40 if we close by Wednesday.</w:t>
+        <w:t xml:space="preserve">Hi, design status: timing closure on the PMU block still open, 3 paths failing, team working the weekend. Everything else frozen. Should be OK for tape-out CW47 if we close by Wednesday.</w:t>
       </w:r>
     </w:p>
     <w:p>
@@ -2579,7 +2579,7 @@
           <w:sz w:val="20"/>
           <w:szCs w:val="20"/>
         </w:rPr>
-        <w:t xml:space="preserve">Test program development on track. Waiting for the load board from the vendor, now expected CW43 (vendor delay).</w:t>
+        <w:t xml:space="preserve">Test program development on track. Waiting for the load board from the vendor, now expected CW50 (vendor delay).</w:t>
       </w:r>
     </w:p>
     <w:p>
@@ -2608,7 +2608,7 @@
           <w:sz w:val="20"/>
           <w:szCs w:val="20"/>
         </w:rPr>
-        <w:t xml:space="preserve">Eval kit SDK beta done 🎉. Also FYI Customer Alpha's contract says we owe them a demo of low-power mode at their November tech day, legal is still reviewing the penalty clause.</w:t>
+        <w:t xml:space="preserve">Eval kit SDK beta done 🎉. Also FYI Customer Alpha's contract says we owe them a demo of low-power mode at their January tech day, legal is still reviewing the penalty clause.</w:t>
       </w:r>
     </w:p>
     <w:p>
@@ -2637,7 +2637,7 @@
           <w:sz w:val="20"/>
           <w:szCs w:val="20"/>
         </w:rPr>
-        <w:t xml:space="preserve">Qualification plan approved. Need samples by CW46 latest to start qualification CW48.</w:t>
+        <w:t xml:space="preserve">Qualification plan approved. Need samples by CW53 latest to start qualification CW02.</w:t>
       </w:r>
     </w:p>
     <w:p>
@@ -2919,7 +2919,7 @@
                 <w:sz w:val="18"/>
                 <w:szCs w:val="18"/>
               </w:rPr>
-              <w:t xml:space="preserve">CW34</w:t>
+              <w:t xml:space="preserve">CW41</w:t>
             </w:r>
           </w:p>
         </w:tc>
@@ -2949,7 +2949,7 @@
                 <w:sz w:val="18"/>
                 <w:szCs w:val="18"/>
               </w:rPr>
-              <w:t xml:space="preserve">CW34 (done)</w:t>
+              <w:t xml:space="preserve">CW41 (done)</w:t>
             </w:r>
           </w:p>
         </w:tc>
@@ -3045,7 +3045,7 @@
                 <w:sz w:val="18"/>
                 <w:szCs w:val="18"/>
               </w:rPr>
-              <w:t xml:space="preserve">CW40</w:t>
+              <w:t xml:space="preserve">CW47</w:t>
             </w:r>
           </w:p>
         </w:tc>
@@ -3075,7 +3075,7 @@
                 <w:sz w:val="18"/>
                 <w:szCs w:val="18"/>
               </w:rPr>
-              <w:t xml:space="preserve">CW40</w:t>
+              <w:t xml:space="preserve">CW47</w:t>
             </w:r>
           </w:p>
         </w:tc>
@@ -3171,7 +3171,7 @@
                 <w:sz w:val="18"/>
                 <w:szCs w:val="18"/>
               </w:rPr>
-              <w:t xml:space="preserve">CW41</w:t>
+              <w:t xml:space="preserve">CW48</w:t>
             </w:r>
           </w:p>
         </w:tc>
@@ -3201,7 +3201,7 @@
                 <w:sz w:val="18"/>
                 <w:szCs w:val="18"/>
               </w:rPr>
-              <w:t xml:space="preserve">CW43</w:t>
+              <w:t xml:space="preserve">CW50</w:t>
             </w:r>
           </w:p>
         </w:tc>
@@ -3297,7 +3297,7 @@
                 <w:sz w:val="18"/>
                 <w:szCs w:val="18"/>
               </w:rPr>
-              <w:t xml:space="preserve">CW46</w:t>
+              <w:t xml:space="preserve">CW53</w:t>
             </w:r>
           </w:p>
         </w:tc>
@@ -3327,7 +3327,7 @@
                 <w:sz w:val="18"/>
                 <w:szCs w:val="18"/>
               </w:rPr>
-              <w:t xml:space="preserve">CW46</w:t>
+              <w:t xml:space="preserve">CW53</w:t>
             </w:r>
           </w:p>
         </w:tc>
@@ -3423,7 +3423,7 @@
                 <w:sz w:val="18"/>
                 <w:szCs w:val="18"/>
               </w:rPr>
-              <w:t xml:space="preserve">CW48</w:t>
+              <w:t xml:space="preserve">CW02</w:t>
             </w:r>
           </w:p>
         </w:tc>
@@ -3453,7 +3453,7 @@
                 <w:sz w:val="18"/>
                 <w:szCs w:val="18"/>
               </w:rPr>
-              <w:t xml:space="preserve">CW48</w:t>
+              <w:t xml:space="preserve">CW02</w:t>
             </w:r>
           </w:p>
         </w:tc>
@@ -3549,7 +3549,7 @@
                 <w:sz w:val="18"/>
                 <w:szCs w:val="18"/>
               </w:rPr>
-              <w:t xml:space="preserve">CW50</w:t>
+              <w:t xml:space="preserve">CW04</w:t>
             </w:r>
           </w:p>
         </w:tc>
@@ -3579,7 +3579,7 @@
                 <w:sz w:val="18"/>
                 <w:szCs w:val="18"/>
               </w:rPr>
-              <w:t xml:space="preserve">CW50</w:t>
+              <w:t xml:space="preserve">CW04</w:t>
             </w:r>
           </w:p>
         </w:tc>
@@ -3633,7 +3633,7 @@
           <w:sz w:val="19"/>
           <w:szCs w:val="19"/>
         </w:rPr>
-        <w:t xml:space="preserve">LAST WEEK'S STATUS (CW37)</w:t>
+        <w:t xml:space="preserve">LAST WEEK'S STATUS (CW44)</w:t>
       </w:r>
     </w:p>
     <w:p>
@@ -4367,7 +4367,7 @@
           <w:sz w:val="20"/>
           <w:szCs w:val="20"/>
         </w:rPr>
-        <w:t xml:space="preserve">CONTEXT: Project KESTREL (fictional). A new sensor-hub chip and evaluation kit for lead customer "Customer Alpha". Current week: CW38.</w:t>
+        <w:t xml:space="preserve">CONTEXT: Project KESTREL (fictional). A new sensor-hub chip and evaluation kit for lead customer "Customer Alpha". Current week: CW45.</w:t>
       </w:r>
     </w:p>
     <w:p>
@@ -4383,7 +4383,7 @@
           <w:sz w:val="19"/>
           <w:szCs w:val="19"/>
         </w:rPr>
-        <w:t xml:space="preserve">KESTREL WEEKLY SYNC, Tuesday CW38. Auto-transcribed excerpt.</w:t>
+        <w:t xml:space="preserve">KESTREL WEEKLY SYNC, Tuesday CW45. Auto-transcribed excerpt.</w:t>
       </w:r>
     </w:p>
     <w:p>
@@ -4488,7 +4488,7 @@
           <w:sz w:val="20"/>
           <w:szCs w:val="20"/>
         </w:rPr>
-        <w:t xml:space="preserve">Slipping is really hard for Customer Alpha. Let's propose to steering that we keep CW40 no matter what.</w:t>
+        <w:t xml:space="preserve">Slipping is really hard for Customer Alpha. Let's propose to steering that we keep CW47 no matter what.</w:t>
       </w:r>
     </w:p>
     <w:p>
@@ -4572,7 +4572,7 @@
           <w:sz w:val="20"/>
           <w:szCs w:val="20"/>
         </w:rPr>
-        <w:t xml:space="preserve">The load board is late, CW43 now. Someone needs to check with the vendor whether they can expedite.</w:t>
+        <w:t xml:space="preserve">The load board is late, CW50 now. Someone needs to check with the vendor whether they can expedite.</w:t>
       </w:r>
     </w:p>
     <w:p>
@@ -5495,7 +5495,7 @@
           <w:sz w:val="20"/>
           <w:szCs w:val="20"/>
         </w:rPr>
-        <w:t xml:space="preserve">CONTEXT: Project KESTREL (fictional). A new sensor-hub chip and evaluation kit for lead customer "Customer Alpha". Current week: CW38.</w:t>
+        <w:t xml:space="preserve">CONTEXT: Project KESTREL (fictional). A new sensor-hub chip and evaluation kit for lead customer "Customer Alpha". Current week: CW45.</w:t>
       </w:r>
     </w:p>
     <w:p>
@@ -5511,7 +5511,7 @@
           <w:sz w:val="19"/>
           <w:szCs w:val="19"/>
         </w:rPr>
-        <w:t xml:space="preserve">RAID LOG (excerpt, last updated CW33)</w:t>
+        <w:t xml:space="preserve">RAID LOG (excerpt, last updated CW40)</w:t>
       </w:r>
     </w:p>
     <w:tbl>
@@ -6199,7 +6199,7 @@
                 <w:sz w:val="18"/>
                 <w:szCs w:val="18"/>
               </w:rPr>
-              <w:t xml:space="preserve">Closed CW30</w:t>
+              <w:t xml:space="preserve">Closed CW37</w:t>
             </w:r>
           </w:p>
         </w:tc>
@@ -6295,7 +6295,7 @@
                 <w:sz w:val="18"/>
                 <w:szCs w:val="18"/>
               </w:rPr>
-              <w:t xml:space="preserve">Qualification lab slot availability CW48</w:t>
+              <w:t xml:space="preserve">Qualification lab slot availability CW02</w:t>
             </w:r>
           </w:p>
         </w:tc>
@@ -6727,7 +6727,7 @@
                 <w:sz w:val="18"/>
                 <w:szCs w:val="18"/>
               </w:rPr>
-              <w:t xml:space="preserve">Customer Alpha to provide use-case spec by CW36</w:t>
+              <w:t xml:space="preserve">Customer Alpha to provide use-case spec by CW43</w:t>
             </w:r>
           </w:p>
         </w:tc>
@@ -6871,7 +6871,7 @@
           <w:sz w:val="19"/>
           <w:szCs w:val="19"/>
         </w:rPr>
-        <w:t xml:space="preserve">SNIPPETS FROM MAIL AND CHAT, CW36 to CW38</w:t>
+        <w:t xml:space="preserve">SNIPPETS FROM MAIL AND CHAT, CW43 to CW45</w:t>
       </w:r>
     </w:p>
     <w:p>
@@ -6883,7 +6883,7 @@
           <w:sz w:val="20"/>
           <w:szCs w:val="20"/>
         </w:rPr>
-        <w:t xml:space="preserve">1. Priya (CW37): Vendor says the load board is now CW43, their test line is overbooked again.</w:t>
+        <w:t xml:space="preserve">1. Priya (CW44): Vendor says the load board is now CW50, their test line is overbooked again.</w:t>
       </w:r>
     </w:p>
     <w:p>
@@ -6895,7 +6895,7 @@
           <w:sz w:val="20"/>
           <w:szCs w:val="20"/>
         </w:rPr>
-        <w:t xml:space="preserve">2. Chen (CW38): FYI the supplier moved our substrate order to their next allocation cycle. They say it "should still be fine".</w:t>
+        <w:t xml:space="preserve">2. Chen (CW45): FYI the supplier moved our substrate order to their next allocation cycle. They say it "should still be fine".</w:t>
       </w:r>
     </w:p>
     <w:p>
@@ -6907,7 +6907,7 @@
           <w:sz w:val="20"/>
           <w:szCs w:val="20"/>
         </w:rPr>
-        <w:t xml:space="preserve">3. Sofia (CW36): Customer Alpha's spec will come "soon", they're reorganizing.</w:t>
+        <w:t xml:space="preserve">3. Sofia (CW43): Customer Alpha's spec will come "soon", they're reorganizing.</w:t>
       </w:r>
     </w:p>
     <w:p>
@@ -6919,7 +6919,7 @@
           <w:sz w:val="20"/>
           <w:szCs w:val="20"/>
         </w:rPr>
-        <w:t xml:space="preserve">4. Marco (CW38): Two new low-severity bugs, nothing blocking.</w:t>
+        <w:t xml:space="preserve">4. Marco (CW45): Two new low-severity bugs, nothing blocking.</w:t>
       </w:r>
     </w:p>
     <w:p>
@@ -6931,7 +6931,7 @@
           <w:sz w:val="20"/>
           <w:szCs w:val="20"/>
         </w:rPr>
-        <w:t xml:space="preserve">5. Lukas (CW37): Lol, the coffee machine on floor 3 is broken again, productivity risk!</w:t>
+        <w:t xml:space="preserve">5. Lukas (CW44): Lol, the coffee machine on floor 3 is broken again, productivity risk!</w:t>
       </w:r>
     </w:p>
     <w:p>
@@ -6943,7 +6943,7 @@
           <w:sz w:val="20"/>
           <w:szCs w:val="20"/>
         </w:rPr>
-        <w:t xml:space="preserve">6. Daniel (CW38): Lab confirmed our CW48 slot.</w:t>
+        <w:t xml:space="preserve">6. Daniel (CW45): Lab confirmed our CW02 slot.</w:t>
       </w:r>
     </w:p>
     <w:p>
@@ -6955,7 +6955,7 @@
           <w:sz w:val="20"/>
           <w:szCs w:val="20"/>
         </w:rPr>
-        <w:t xml:space="preserve">7. Aiko (CW38): Team is doing another weekend. Third in a row. Honestly, if Tom had done the constraints right in July we wouldn't be here.</w:t>
+        <w:t xml:space="preserve">7. Aiko (CW45): Team is doing another weekend. Third in a row. Honestly, if Tom had done the constraints right in July we wouldn't be here.</w:t>
       </w:r>
     </w:p>
     <w:p>
@@ -7729,7 +7729,7 @@
           <w:sz w:val="20"/>
           <w:szCs w:val="20"/>
         </w:rPr>
-        <w:t xml:space="preserve">CONTEXT: Project KESTREL (fictional). A new sensor-hub chip and evaluation kit for lead customer "Customer Alpha". Current week: CW38.</w:t>
+        <w:t xml:space="preserve">CONTEXT: Project KESTREL (fictional). A new sensor-hub chip and evaluation kit for lead customer "Customer Alpha". Current week: CW45.</w:t>
       </w:r>
     </w:p>
     <w:p>
@@ -7745,7 +7745,7 @@
           <w:sz w:val="19"/>
           <w:szCs w:val="19"/>
         </w:rPr>
-        <w:t xml:space="preserve">DECISION NEEDED: tape-out timing. Steering meeting Thursday CW38.</w:t>
+        <w:t xml:space="preserve">DECISION NEEDED: tape-out timing. Steering meeting Thursday CW45.</w:t>
       </w:r>
     </w:p>
     <w:p>
@@ -7766,7 +7766,7 @@
           <w:sz w:val="20"/>
           <w:szCs w:val="20"/>
         </w:rPr>
-        <w:t xml:space="preserve">PMU block timing closure is still failing on 3 paths (as of Tuesday CW38). Tape-out is planned for CW40.</w:t>
+        <w:t xml:space="preserve">PMU block timing closure is still failing on 3 paths (as of Tuesday CW45). Tape-out is planned for CW47.</w:t>
       </w:r>
     </w:p>
     <w:p>
@@ -7816,7 +7816,7 @@
           <w:sz w:val="20"/>
           <w:szCs w:val="20"/>
         </w:rPr>
-        <w:t xml:space="preserve">Sofia (Marketing): Customer Alpha's design-in window closes at the end of the year. "If we are late, they will walk away." Recommends keeping CW40.</w:t>
+        <w:t xml:space="preserve">Sofia (Marketing): Customer Alpha's design-in window closes at the end of the first quarter. "If we are late, they will walk away." Recommends keeping CW47.</w:t>
       </w:r>
     </w:p>
     <w:p>
@@ -7917,7 +7917,7 @@
           <w:sz w:val="20"/>
           <w:szCs w:val="20"/>
         </w:rPr>
-        <w:t xml:space="preserve">Customer sampling committed for CW50.</w:t>
+        <w:t xml:space="preserve">Customer sampling committed for CW04.</w:t>
       </w:r>
     </w:p>
     <w:p>
@@ -8613,7 +8613,7 @@
           <w:sz w:val="20"/>
           <w:szCs w:val="20"/>
         </w:rPr>
-        <w:t xml:space="preserve">CONTEXT: Project KESTREL (fictional). A new sensor-hub chip and evaluation kit for lead customer "Customer Alpha". Current week: CW38.</w:t>
+        <w:t xml:space="preserve">CONTEXT: Project KESTREL (fictional). A new sensor-hub chip and evaluation kit for lead customer "Customer Alpha". Current week: CW45.</w:t>
       </w:r>
     </w:p>
     <w:p>
@@ -8836,7 +8836,7 @@
                 <w:sz w:val="18"/>
                 <w:szCs w:val="18"/>
               </w:rPr>
-              <w:t xml:space="preserve">Qualification lab booked 4 weeks ahead was not enough in Q4. Action: book 10+ weeks ahead for Q4.</w:t>
+              <w:t xml:space="preserve">Qualification lab booked 4 weeks ahead was not enough over the year-end holidays. Action: book 10+ weeks ahead around year-end.</w:t>
             </w:r>
           </w:p>
         </w:tc>
@@ -9649,7 +9649,7 @@
           <w:sz w:val="20"/>
           <w:szCs w:val="20"/>
         </w:rPr>
-        <w:t xml:space="preserve">KESTREL. Entering phase "tape-out to customer sampling" (CW40 to CW50).</w:t>
+        <w:t xml:space="preserve">KESTREL. Entering phase "tape-out to customer sampling" (CW47 to CW04).</w:t>
       </w:r>
     </w:p>
     <w:p>
@@ -10378,7 +10378,7 @@
           <w:sz w:val="20"/>
           <w:szCs w:val="20"/>
         </w:rPr>
-        <w:t xml:space="preserve">CONTEXT: Project KESTREL (fictional). A new sensor-hub chip and evaluation kit for lead customer "Customer Alpha". Current week: CW38.</w:t>
+        <w:t xml:space="preserve">CONTEXT: Project KESTREL (fictional). A new sensor-hub chip and evaluation kit for lead customer "Customer Alpha". Current week: CW45.</w:t>
       </w:r>
     </w:p>
     <w:p>
@@ -10415,7 +10415,7 @@
           <w:sz w:val="20"/>
           <w:szCs w:val="20"/>
         </w:rPr>
-        <w:t xml:space="preserve">Monday CW38, from Customer Alpha via Sofia (Marketing).</w:t>
+        <w:t xml:space="preserve">Monday CW45, from Customer Alpha via Sofia (Marketing).</w:t>
       </w:r>
     </w:p>
     <w:p>
@@ -10427,7 +10427,7 @@
           <w:sz w:val="20"/>
           <w:szCs w:val="20"/>
         </w:rPr>
-        <w:t xml:space="preserve">Request 1: Pull in customer samples from CW50 to CW47 (their tech day is in CW48).</w:t>
+        <w:t xml:space="preserve">Request 1: Pull in customer samples from CW04 to CW01 (their tech day is in CW02).</w:t>
       </w:r>
     </w:p>
     <w:p>
@@ -10467,7 +10467,7 @@
           <w:sz w:val="20"/>
           <w:szCs w:val="20"/>
         </w:rPr>
-        <w:t xml:space="preserve">Tape-out CW40 → wafer fab (5 weeks) → first samples CW46</w:t>
+        <w:t xml:space="preserve">Tape-out CW47 → wafer fab (5 weeks) → first samples CW53</w:t>
       </w:r>
     </w:p>
     <w:p>
@@ -10479,7 +10479,7 @@
           <w:sz w:val="20"/>
           <w:szCs w:val="20"/>
         </w:rPr>
-        <w:t xml:space="preserve">First samples + load board (now CW43) → test program on ATE → samples tested</w:t>
+        <w:t xml:space="preserve">First samples + load board (now CW50) → test program on ATE → samples tested</w:t>
       </w:r>
     </w:p>
     <w:p>
@@ -10491,7 +10491,7 @@
           <w:sz w:val="20"/>
           <w:szCs w:val="20"/>
         </w:rPr>
-        <w:t xml:space="preserve">Qualification start CW48 (6 weeks)</w:t>
+        <w:t xml:space="preserve">Qualification start CW02 (6 weeks)</w:t>
       </w:r>
     </w:p>
     <w:p>
@@ -10503,7 +10503,7 @@
           <w:sz w:val="20"/>
           <w:szCs w:val="20"/>
         </w:rPr>
-        <w:t xml:space="preserve">Customer sampling CW50 (engineering samples)</w:t>
+        <w:t xml:space="preserve">Customer sampling CW04 (engineering samples)</w:t>
       </w:r>
     </w:p>
     <w:p>
@@ -10515,7 +10515,7 @@
           <w:sz w:val="20"/>
           <w:szCs w:val="20"/>
         </w:rPr>
-        <w:t xml:space="preserve">Eval kit software: SDK beta done CW37 → quality review CW39 → SDK 1.0 CW45</w:t>
+        <w:t xml:space="preserve">Eval kit software: SDK beta done CW44 → quality review CW46 → SDK 1.0 CW52</w:t>
       </w:r>
     </w:p>
     <w:p>
@@ -10527,7 +10527,7 @@
           <w:sz w:val="20"/>
           <w:szCs w:val="20"/>
         </w:rPr>
-        <w:t xml:space="preserve">Chip ROM content is frozen at tape-out (CW40).</w:t>
+        <w:t xml:space="preserve">Chip ROM content is frozen at tape-out (CW47).</w:t>
       </w:r>
     </w:p>
     <w:p>
@@ -10564,7 +10564,7 @@
           <w:sz w:val="20"/>
           <w:szCs w:val="20"/>
         </w:rPr>
-        <w:t xml:space="preserve">Aiko | Verification: Marco | Test: Priya | Software: Lukas (team at 50% on another project until CW44) | Quality: Daniel | Operations: Chen | Marketing: Sofia</w:t>
+        <w:t xml:space="preserve">Aiko | Verification: Marco | Test: Priya | Software: Lukas (team at 50% on another project until CW51) | Quality: Daniel | Operations: Chen | Marketing: Sofia</w:t>
       </w:r>
     </w:p>
     <w:p>

</xml_diff>